<commit_message>
fix(02): KB row -> full-import-in-progress (757,810 target, 378,894+ @10-29); converge root/docs md; surgical docx cell update; manifest refresh
Co-Authored-By: Claude Code <noreply@anthropic.com>
</commit_message>
<xml_diff>
--- a/02-Nexent平台智能体设计说明.docx
+++ b/02-Nexent平台智能体设计说明.docx
@@ -6185,13 +6185,7 @@
           </w:tcPr>
           <w:p>
             <w:r>
-              <w:t xml:space="preserve">✅ </w:t>
-            </w:r>
-            <w:r>
-              <w:rPr>
-                <w:b/>
-              </w:rPr>
-              <w:t>已接入（子集）</w:t>
+              <w:t>✅ 已接入（全量导入中）</w:t>
             </w:r>
           </w:p>
         </w:tc>
@@ -6201,74 +6195,7 @@
           </w:tcPr>
           <w:p>
             <w:r>
-              <w:t xml:space="preserve">Nexent 知识库索引 </w:t>
-            </w:r>
-            <w:r>
-              <w:rPr>
-                <w:rFonts w:ascii="Consolas" w:hAnsi="Consolas"/>
-                <w:sz w:val="18"/>
-              </w:rPr>
-              <w:t>1-43ce427e8b5447ecad015534f953e084</w:t>
-            </w:r>
-            <w:r>
-              <w:t xml:space="preserve">（1024 维）已建立，截至 2026-10-17 已入库 </w:t>
-            </w:r>
-            <w:r>
-              <w:rPr>
-                <w:b/>
-              </w:rPr>
-              <w:t>15,494 块</w:t>
-            </w:r>
-            <w:r>
-              <w:t xml:space="preserve">（先导 5,503 + 增量 9,991，ES </w:t>
-            </w:r>
-            <w:r>
-              <w:rPr>
-                <w:rFonts w:ascii="Consolas" w:hAnsi="Consolas"/>
-                <w:sz w:val="18"/>
-              </w:rPr>
-              <w:t>_count</w:t>
-            </w:r>
-            <w:r>
-              <w:t xml:space="preserve"> 实测）；检索底座为 Elasticsearch（</w:t>
-            </w:r>
-            <w:r>
-              <w:rPr>
-                <w:rFonts w:ascii="Consolas" w:hAnsi="Consolas"/>
-                <w:sz w:val="18"/>
-              </w:rPr>
-              <w:t>:9220</w:t>
-            </w:r>
-            <w:r>
-              <w:t>）。</w:t>
-            </w:r>
-            <w:r>
-              <w:rPr>
-                <w:b/>
-              </w:rPr>
-              <w:t>全量 1,864,451 块按 CPU 时代 0.8 块/秒约 27 天</w:t>
-            </w:r>
-            <w:r>
-              <w:t>（</w:t>
-            </w:r>
-            <w:r>
-              <w:rPr>
-                <w:b/>
-              </w:rPr>
-              <w:t>GPU 后 2026-10-18 重测约 15–16 小时</w:t>
-            </w:r>
-            <w:r>
-              <w:t xml:space="preserve">，见 </w:t>
-            </w:r>
-            <w:r>
-              <w:rPr>
-                <w:rFonts w:ascii="Consolas" w:hAnsi="Consolas"/>
-                <w:sz w:val="18"/>
-              </w:rPr>
-              <w:t>241-ict-gpu-embedding.md</w:t>
-            </w:r>
-            <w:r>
-              <w:t xml:space="preserve"> §5），需定筛选策略（见《待补充清单》#29）</w:t>
+              <w:t>Nexent 知识库索引 1-43ce427e8b5447ecad015534f953e084（1024 维）已建立，截至 2026-10-17 已入库 15,494 块（先导 5,503 + 增量 9,991，ES _count 实测）；检索底座为 Elasticsearch（:9220）。政务语料 757,810 块全量导入进行中（2026-10-29 时点已入 378,894+ 块，GPU 断点续跑、重启自愈）</w:t>
             </w:r>
           </w:p>
         </w:tc>

</xml_diff>